<commit_message>
PCE7 - Control de Pagos No Identificados (estructura correcta)
</commit_message>
<xml_diff>
--- a/workspaces/instructivos/PCE7.docx
+++ b/workspaces/instructivos/PCE7.docx
@@ -552,564 +552,18 @@
         <w:t xml:space="preserve">• Respaldo: Mantener copia en carpeta compartida D:\COBRANZA\COBRANZA\DepósitosDiarios\</w:t>
       </w:r>
     </w:p>
-    <w:sdt>
-      <w:sdtPr>
-        <w:rPr>
-          <w:rFonts w:eastAsiaTheme="minorHAnsi"/>
-          <w:color w:val="4472C4" w:themeColor="accent1"/>
-          <w:lang w:eastAsia="en-US"/>
-        </w:rPr>
-        <w:id w:val="-440377756"/>
-        <w:docPartObj>
-          <w:docPartGallery w:val="Cover Pages"/>
-          <w:docPartUnique/>
-        </w:docPartObj>
-      </w:sdtPr>
-      <w:sdtEndPr>
-        <w:rPr>
-          <w:color w:val="auto"/>
-        </w:rPr>
-      </w:sdtEndPr>
-      <w:sdtContent>
-        <w:p>
-          <w:pPr>
-            <w:pStyle w:val="Sinespaciado"/>
-            <w:spacing w:before="1540" w:after="240"/>
-            <w:jc w:val="center"/>
-            <w:rPr>
-              <w:color w:val="4472C4" w:themeColor="accent1"/>
-            </w:rPr>
-          </w:pPr>
-          <w:r>
-            <w:rPr>
-              <w:noProof/>
-              <w:color w:val="4472C4" w:themeColor="accent1"/>
-            </w:rPr>
-            <w:drawing>
-              <wp:anchor distT="0" distB="0" distL="114300" distR="114300" simplePos="0" relativeHeight="251660288" behindDoc="1" locked="0" layoutInCell="1" allowOverlap="1" wp14:anchorId="2A319411" wp14:editId="408A8320">
-                <wp:simplePos x="0" y="0"/>
-                <wp:positionH relativeFrom="column">
-                  <wp:posOffset>2139315</wp:posOffset>
-                </wp:positionH>
-                <wp:positionV relativeFrom="page">
-                  <wp:posOffset>1495425</wp:posOffset>
-                </wp:positionV>
-                <wp:extent cx="1711960" cy="1649730"/>
-                <wp:effectExtent l="0" t="0" r="2540" b="7620"/>
-                <wp:wrapTight wrapText="bothSides">
-                  <wp:wrapPolygon edited="0">
-                    <wp:start x="0" y="0"/>
-                    <wp:lineTo x="0" y="21450"/>
-                    <wp:lineTo x="21392" y="21450"/>
-                    <wp:lineTo x="21392" y="0"/>
-                    <wp:lineTo x="0" y="0"/>
-                  </wp:wrapPolygon>
-                </wp:wrapTight>
-                <wp:docPr id="143" name="Imagen 43"/>
-                <wp:cNvGraphicFramePr>
-                  <a:graphicFrameLocks xmlns:a="http://schemas.openxmlformats.org/drawingml/2006/main" noChangeAspect="1"/>
-                </wp:cNvGraphicFramePr>
-                <a:graphic xmlns:a="http://schemas.openxmlformats.org/drawingml/2006/main">
-                  <a:graphicData uri="http://schemas.openxmlformats.org/drawingml/2006/picture">
-                    <pic:pic xmlns:pic="http://schemas.openxmlformats.org/drawingml/2006/picture">
-                      <pic:nvPicPr>
-                        <pic:cNvPr id="143" name="Imagen 43"/>
-                        <pic:cNvPicPr/>
-                      </pic:nvPicPr>
-                      <pic:blipFill>
-                        <a:blip r:embed="rId8">
-                          <a:extLst>
-                            <a:ext uri="{28A0092B-C50C-407E-A947-70E740481C1C}">
-                              <a14:useLocalDpi xmlns:a14="http://schemas.microsoft.com/office/drawing/2010/main" val="0"/>
-                            </a:ext>
-                          </a:extLst>
-                        </a:blip>
-                        <a:stretch>
-                          <a:fillRect/>
-                        </a:stretch>
-                      </pic:blipFill>
-                      <pic:spPr>
-                        <a:xfrm>
-                          <a:off x="0" y="0"/>
-                          <a:ext cx="1711960" cy="1649730"/>
-                        </a:xfrm>
-                        <a:prstGeom prst="rect">
-                          <a:avLst/>
-                        </a:prstGeom>
-                        <a:noFill/>
-                        <a:ln>
-                          <a:noFill/>
-                        </a:ln>
-                      </pic:spPr>
-                    </pic:pic>
-                  </a:graphicData>
-                </a:graphic>
-              </wp:anchor>
-            </w:drawing>
-          </w:r>
-          <w:r>
-            <w:rPr>
-              <w:noProof/>
-              <w:color w:val="4472C4" w:themeColor="accent1"/>
-            </w:rPr>
-            <mc:AlternateContent>
-              <mc:Choice Requires="wps">
-                <w:drawing>
-                  <wp:anchor distT="0" distB="0" distL="114300" distR="114300" simplePos="0" relativeHeight="251661312" behindDoc="0" locked="0" layoutInCell="1" allowOverlap="1" wp14:anchorId="55239941" wp14:editId="4C9FAA9F">
-                    <wp:simplePos x="0" y="0"/>
-                    <wp:positionH relativeFrom="column">
-                      <wp:posOffset>-632460</wp:posOffset>
-                    </wp:positionH>
-                    <wp:positionV relativeFrom="page">
-                      <wp:posOffset>323850</wp:posOffset>
-                    </wp:positionV>
-                    <wp:extent cx="4762500" cy="3352800"/>
-                    <wp:effectExtent l="0" t="0" r="57150" b="38100"/>
-                    <wp:wrapNone/>
-                    <wp:docPr id="684695588" name="Medio marco 1"/>
-                    <wp:cNvGraphicFramePr/>
-                    <a:graphic xmlns:a="http://schemas.openxmlformats.org/drawingml/2006/main">
-                      <a:graphicData uri="http://schemas.microsoft.com/office/word/2010/wordprocessingShape">
-                        <wps:wsp>
-                          <wps:cNvSpPr/>
-                          <wps:spPr>
-                            <a:xfrm>
-                              <a:off x="0" y="0"/>
-                              <a:ext cx="4762500" cy="3352800"/>
-                            </a:xfrm>
-                            <a:prstGeom prst="halfFrame">
-                              <a:avLst>
-                                <a:gd name="adj1" fmla="val 5113"/>
-                                <a:gd name="adj2" fmla="val 1856"/>
-                              </a:avLst>
-                            </a:prstGeom>
-                          </wps:spPr>
-                          <wps:style>
-                            <a:lnRef idx="2">
-                              <a:schemeClr val="accent1">
-                                <a:shade val="15000"/>
-                              </a:schemeClr>
-                            </a:lnRef>
-                            <a:fillRef idx="1">
-                              <a:schemeClr val="accent1"/>
-                            </a:fillRef>
-                            <a:effectRef idx="0">
-                              <a:schemeClr val="accent1"/>
-                            </a:effectRef>
-                            <a:fontRef idx="minor">
-                              <a:schemeClr val="lt1"/>
-                            </a:fontRef>
-                          </wps:style>
-                          <wps:bodyPr rot="0" spcFirstLastPara="0" vertOverflow="overflow" horzOverflow="overflow" vert="horz" wrap="square" lIns="91440" tIns="45720" rIns="91440" bIns="45720" numCol="1" spcCol="0" rtlCol="0" fromWordArt="0" anchor="ctr" anchorCtr="0" forceAA="0" compatLnSpc="1">
-                            <a:prstTxWarp prst="textNoShape">
-                              <a:avLst/>
-                            </a:prstTxWarp>
-                            <a:noAutofit/>
-                          </wps:bodyPr>
-                        </wps:wsp>
-                      </a:graphicData>
-                    </a:graphic>
-                    <wp14:sizeRelH relativeFrom="margin">
-                      <wp14:pctWidth>0</wp14:pctWidth>
-                    </wp14:sizeRelH>
-                    <wp14:sizeRelV relativeFrom="margin">
-                      <wp14:pctHeight>0</wp14:pctHeight>
-                    </wp14:sizeRelV>
-                  </wp:anchor>
-                </w:drawing>
-              </mc:Choice>
-              <mc:Fallback xmlns:oel="http://schemas.microsoft.com/office/2019/extlst" xmlns:w16du="http://schemas.microsoft.com/office/word/2023/wordml/word16du" xmlns:w16sdtfl="http://schemas.microsoft.com/office/word/2024/wordml/sdtformatlock">
-                <w:pict>
-                  <v:shape w14:anchorId="137F8D47" id="Medio marco 1" o:spid="_x0000_s1026" style="position:absolute;margin-left:-49.8pt;margin-top:25.5pt;width:375pt;height:264pt;z-index:251661312;visibility:visible;mso-wrap-style:square;mso-width-percent:0;mso-height-percent:0;mso-wrap-distance-left:9pt;mso-wrap-distance-top:0;mso-wrap-distance-right:9pt;mso-wrap-distance-bottom:0;mso-position-horizontal:absolute;mso-position-horizontal-relative:text;mso-position-vertical:absolute;mso-position-vertical-relative:page;mso-width-percent:0;mso-height-percent:0;mso-width-relative:margin;mso-height-relative:margin;v-text-anchor:middle" coordsize="4762500,3352800" o:gfxdata="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" path="m,l4762500,,4518993,171429r-4456765,l62228,3308992,,3352800,,xe" fillcolor="#4472c4 [3204]" strokecolor="#09101d [484]" strokeweight="1pt">
-                    <v:stroke joinstyle="miter"/>
-                    <v:path arrowok="t" o:connecttype="custom" o:connectlocs="0,0;4762500,0;4518993,171429;62228,171429;62228,3308992;0,3352800;0,0" o:connectangles="0,0,0,0,0,0,0"/>
-                    <w10:wrap anchory="page"/>
-                  </v:shape>
-                </w:pict>
-              </mc:Fallback>
-            </mc:AlternateContent>
-          </w:r>
-        </w:p>
-        <w:p>
-          <w:pPr>
-            <w:pStyle w:val="Sinespaciado"/>
-            <w:spacing w:before="1540" w:after="240"/>
-            <w:jc w:val="center"/>
-            <w:rPr>
-              <w:color w:val="4472C4" w:themeColor="accent1"/>
-            </w:rPr>
-          </w:pPr>
-        </w:p>
-        <w:sdt>
-          <w:sdtPr>
-            <w:rPr>
-              <w:rFonts w:asciiTheme="majorHAnsi" w:eastAsiaTheme="majorEastAsia" w:hAnsiTheme="majorHAnsi" w:cstheme="majorBidi"/>
-              <w:b/>
-              <w:bCs/>
-              <w:caps/>
-              <w:color w:val="4472C4" w:themeColor="accent1"/>
-              <w:sz w:val="72"/>
-              <w:szCs w:val="72"/>
-            </w:rPr>
-            <w:alias w:val="Título"/>
-            <w:tag w:val=""/>
-            <w:id w:val="1735040861"/>
-            <w:placeholder>
-              <w:docPart w:val="907FCECB528541EA8D8B12CCC68954D5"/>
-            </w:placeholder>
-            <w:dataBinding w:prefixMappings="xmlns:ns0='http://purl.org/dc/elements/1.1/' xmlns:ns1='http://schemas.openxmlformats.org/package/2006/metadata/core-properties' " w:xpath="/ns1:coreProperties[1]/ns0:title[1]" w:storeItemID="{6C3C8BC8-F283-45AE-878A-BAB7291924A1}"/>
-            <w:text/>
-          </w:sdtPr>
-          <w:sdtEndPr>
-            <w:rPr>
-              <w:sz w:val="80"/>
-              <w:szCs w:val="80"/>
-            </w:rPr>
-          </w:sdtEndPr>
-          <w:sdtContent>
-            <w:p>
-              <w:pPr>
-                <w:pStyle w:val="Sinespaciado"/>
-                <w:pBdr>
-                  <w:top w:val="single" w:sz="6" w:space="6" w:color="4472C4" w:themeColor="accent1"/>
-                  <w:bottom w:val="single" w:sz="6" w:space="6" w:color="4472C4" w:themeColor="accent1"/>
-                </w:pBdr>
-                <w:spacing w:after="240"/>
-                <w:jc w:val="center"/>
-                <w:rPr>
-                  <w:rFonts w:asciiTheme="majorHAnsi" w:eastAsiaTheme="majorEastAsia" w:hAnsiTheme="majorHAnsi" w:cstheme="majorBidi"/>
-                  <w:b/>
-                  <w:bCs/>
-                  <w:caps/>
-                  <w:color w:val="4472C4" w:themeColor="accent1"/>
-                  <w:sz w:val="80"/>
-                  <w:szCs w:val="80"/>
-                </w:rPr>
-              </w:pPr>
-              <w:r>
-                <w:rPr>
-                  <w:rFonts w:asciiTheme="majorHAnsi" w:eastAsiaTheme="majorEastAsia" w:hAnsiTheme="majorHAnsi" w:cstheme="majorBidi"/>
-                  <w:b/>
-                  <w:bCs/>
-                  <w:caps/>
-                  <w:color w:val="4472C4" w:themeColor="accent1"/>
-                  <w:sz w:val="72"/>
-                  <w:szCs w:val="72"/>
-                </w:rPr>
-                <w:t>PROTEG-RT MUTUALIDAD</w:t>
-              </w:r>
-            </w:p>
-          </w:sdtContent>
-        </w:sdt>
-        <w:tbl>
-          <w:tblPr>
-            <w:tblStyle w:val="Tablaconcuadrcula"/>
-            <w:tblpPr w:leftFromText="141" w:rightFromText="141" w:vertAnchor="text" w:horzAnchor="margin" w:tblpXSpec="center" w:tblpY="5338"/>
-            <w:tblW w:w="5774" w:type="pct"/>
-            <w:tblLook w:val="04A0" w:firstRow="1" w:lastRow="0" w:firstColumn="1" w:lastColumn="0" w:noHBand="0" w:noVBand="1"/>
-          </w:tblPr>
-          <w:tblGrid>
-            <w:gridCol w:w="3672"/>
-            <w:gridCol w:w="3110"/>
-            <w:gridCol w:w="3389"/>
-          </w:tblGrid>
-          <w:tr>
-            <w:trPr>
-              <w:trHeight w:val="350"/>
-            </w:trPr>
-            <w:tc>
-              <w:tcPr>
-                <w:tcW w:w="1805" w:type="pct"/>
-                <w:tcBorders>
-                  <w:top w:val="double" w:sz="4" w:space="0" w:color="4472C4" w:themeColor="accent1"/>
-                  <w:left w:val="double" w:sz="4" w:space="0" w:color="4472C4" w:themeColor="accent1"/>
-                  <w:bottom w:val="double" w:sz="4" w:space="0" w:color="4472C4" w:themeColor="accent1"/>
-                  <w:right w:val="double" w:sz="4" w:space="0" w:color="4472C4" w:themeColor="accent1"/>
-                </w:tcBorders>
-              </w:tcPr>
-              <w:p>
-                <w:pPr>
-                  <w:spacing w:after="160" w:line="259" w:lineRule="auto"/>
-                  <w:rPr>
-                    <w:b/>
-                    <w:bCs/>
-                  </w:rPr>
-                </w:pPr>
-                <w:r>
-                  <w:rPr>
-                    <w:b/>
-                    <w:bCs/>
-                  </w:rPr>
-                  <w:t>FIRMA DIRECCIÓN</w:t>
-                </w:r>
-              </w:p>
-            </w:tc>
-            <w:tc>
-              <w:tcPr>
-                <w:tcW w:w="1529" w:type="pct"/>
-                <w:tcBorders>
-                  <w:top w:val="double" w:sz="4" w:space="0" w:color="4472C4" w:themeColor="accent1"/>
-                  <w:left w:val="double" w:sz="4" w:space="0" w:color="4472C4" w:themeColor="accent1"/>
-                  <w:bottom w:val="double" w:sz="4" w:space="0" w:color="4472C4" w:themeColor="accent1"/>
-                  <w:right w:val="double" w:sz="4" w:space="0" w:color="4472C4" w:themeColor="accent1"/>
-                </w:tcBorders>
-                <w:vAlign w:val="center"/>
-              </w:tcPr>
-              <w:p>
-                <w:pPr>
-                  <w:spacing w:after="160" w:line="259" w:lineRule="auto"/>
-                </w:pPr>
-                <w:r>
-                  <w:t xml:space="preserve">DEPT. </w:t>
-                </w:r>
-              </w:p>
-              <w:p>
-                <w:pPr>
-                  <w:spacing w:after="160" w:line="259" w:lineRule="auto"/>
-                </w:pPr>
-                <w:r>
-                  <w:t>ADMINISTRATIVO</w:t>
-                </w:r>
-              </w:p>
-            </w:tc>
-            <w:tc>
-              <w:tcPr>
-                <w:tcW w:w="1666" w:type="pct"/>
-                <w:tcBorders>
-                  <w:top w:val="double" w:sz="4" w:space="0" w:color="4472C4" w:themeColor="accent1"/>
-                  <w:left w:val="double" w:sz="4" w:space="0" w:color="4472C4" w:themeColor="accent1"/>
-                  <w:bottom w:val="double" w:sz="4" w:space="0" w:color="4472C4" w:themeColor="accent1"/>
-                  <w:right w:val="double" w:sz="4" w:space="0" w:color="4472C4" w:themeColor="accent1"/>
-                </w:tcBorders>
-                <w:vAlign w:val="center"/>
-              </w:tcPr>
-              <w:p>
-                <w:pPr>
-                  <w:spacing w:after="160" w:line="259" w:lineRule="auto"/>
-                </w:pPr>
-                <w:r>
-                  <w:t xml:space="preserve">DEPT. </w:t>
-                </w:r>
-              </w:p>
-              <w:p>
-                <w:pPr>
-                  <w:spacing w:after="160" w:line="259" w:lineRule="auto"/>
-                </w:pPr>
-                <w:r>
-                  <w:t>COBRANZA</w:t>
-                </w:r>
-              </w:p>
-            </w:tc>
-          </w:tr>
-          <w:tr>
-            <w:trPr>
-              <w:trHeight w:val="573"/>
-            </w:trPr>
-            <w:tc>
-              <w:tcPr>
-                <w:tcW w:w="1805" w:type="pct"/>
-                <w:tcBorders>
-                  <w:top w:val="double" w:sz="4" w:space="0" w:color="4472C4" w:themeColor="accent1"/>
-                  <w:left w:val="double" w:sz="4" w:space="0" w:color="4472C4" w:themeColor="accent1"/>
-                  <w:bottom w:val="double" w:sz="4" w:space="0" w:color="4472C4" w:themeColor="accent1"/>
-                  <w:right w:val="double" w:sz="4" w:space="0" w:color="4472C4" w:themeColor="accent1"/>
-                </w:tcBorders>
-              </w:tcPr>
-              <w:p>
-                <w:pPr>
-                  <w:spacing w:after="160" w:line="259" w:lineRule="auto"/>
-                </w:pPr>
-              </w:p>
-            </w:tc>
-            <w:tc>
-              <w:tcPr>
-                <w:tcW w:w="1529" w:type="pct"/>
-                <w:tcBorders>
-                  <w:top w:val="double" w:sz="4" w:space="0" w:color="4472C4" w:themeColor="accent1"/>
-                  <w:left w:val="double" w:sz="4" w:space="0" w:color="4472C4" w:themeColor="accent1"/>
-                  <w:bottom w:val="double" w:sz="4" w:space="0" w:color="4472C4" w:themeColor="accent1"/>
-                  <w:right w:val="double" w:sz="4" w:space="0" w:color="4472C4" w:themeColor="accent1"/>
-                </w:tcBorders>
-                <w:vAlign w:val="center"/>
-              </w:tcPr>
-              <w:p>
-                <w:pPr>
-                  <w:spacing w:after="160" w:line="259" w:lineRule="auto"/>
-                </w:pPr>
-                <w:r>
-                  <w:t xml:space="preserve">DEPT. </w:t>
-                </w:r>
-              </w:p>
-              <w:p>
-                <w:pPr>
-                  <w:spacing w:after="160" w:line="259" w:lineRule="auto"/>
-                </w:pPr>
-                <w:r>
-                  <w:t>VENTAS</w:t>
-                </w:r>
-              </w:p>
-            </w:tc>
-            <w:tc>
-              <w:tcPr>
-                <w:tcW w:w="1666" w:type="pct"/>
-                <w:tcBorders>
-                  <w:top w:val="double" w:sz="4" w:space="0" w:color="4472C4" w:themeColor="accent1"/>
-                  <w:left w:val="double" w:sz="4" w:space="0" w:color="4472C4" w:themeColor="accent1"/>
-                  <w:bottom w:val="double" w:sz="4" w:space="0" w:color="4472C4" w:themeColor="accent1"/>
-                  <w:right w:val="double" w:sz="4" w:space="0" w:color="4472C4" w:themeColor="accent1"/>
-                </w:tcBorders>
-                <w:vAlign w:val="center"/>
-              </w:tcPr>
-              <w:p>
-                <w:pPr>
-                  <w:spacing w:after="160" w:line="259" w:lineRule="auto"/>
-                </w:pPr>
-                <w:r>
-                  <w:t xml:space="preserve">DEPT. </w:t>
-                </w:r>
-              </w:p>
-              <w:p>
-                <w:pPr>
-                  <w:spacing w:after="160" w:line="259" w:lineRule="auto"/>
-                </w:pPr>
-                <w:r>
-                  <w:t>JURIDICO</w:t>
-                </w:r>
-              </w:p>
-            </w:tc>
-          </w:tr>
-        </w:tbl>
-        <w:p>
-          <w:pPr>
-            <w:pStyle w:val="Sinespaciado"/>
-            <w:spacing w:before="480"/>
-            <w:jc w:val="center"/>
-            <w:rPr>
-              <w:b/>
-              <w:bCs/>
-              <w:color w:val="4472C4" w:themeColor="accent1"/>
-            </w:rPr>
-          </w:pPr>
-          <w:r>
-            <w:rPr>
-              <w:b/>
-              <w:bCs/>
-              <w:color w:val="4472C4" w:themeColor="accent1"/>
-              <w:sz w:val="28"/>
-              <w:szCs w:val="28"/>
-            </w:rPr>
-            <w:t>PROCEDIMIENTO</w:t>
-          </w:r>
-          <w:r>
-            <w:rPr>
-              <w:b/>
-              <w:bCs/>
-              <w:color w:val="4472C4" w:themeColor="accent1"/>
-              <w:sz w:val="28"/>
-              <w:szCs w:val="28"/>
-            </w:rPr>
-            <w:t xml:space="preserve"> </w:t>
-          </w:r>
-          <w:r>
-            <w:rPr>
-              <w:b/>
-              <w:bCs/>
-              <w:color w:val="4472C4" w:themeColor="accent1"/>
-              <w:sz w:val="28"/>
-              <w:szCs w:val="28"/>
-            </w:rPr>
-            <w:t>CONTROL DE PAGOS NO IDENTIFICADOS</w:t>
-          </w:r>
-        </w:p>
-        <w:p>
-          <w:r>
-            <w:rPr>
-              <w:noProof/>
-              <w:color w:val="4472C4" w:themeColor="accent1"/>
-            </w:rPr>
-            <mc:AlternateContent>
-              <mc:Choice Requires="wps">
-                <w:drawing>
-                  <wp:anchor distT="0" distB="0" distL="114300" distR="114300" simplePos="0" relativeHeight="251663360" behindDoc="1" locked="0" layoutInCell="1" allowOverlap="1" wp14:anchorId="3B3DE900" wp14:editId="4398A091">
-                    <wp:simplePos x="0" y="0"/>
-                    <wp:positionH relativeFrom="column">
-                      <wp:posOffset>1539240</wp:posOffset>
-                    </wp:positionH>
-                    <wp:positionV relativeFrom="page">
-                      <wp:posOffset>6381750</wp:posOffset>
-                    </wp:positionV>
-                    <wp:extent cx="4762500" cy="3352800"/>
-                    <wp:effectExtent l="38100" t="19050" r="19050" b="19050"/>
-                    <wp:wrapNone/>
-                    <wp:docPr id="1717284756" name="Medio marco 1"/>
-                    <wp:cNvGraphicFramePr/>
-                    <a:graphic xmlns:a="http://schemas.openxmlformats.org/drawingml/2006/main">
-                      <a:graphicData uri="http://schemas.microsoft.com/office/word/2010/wordprocessingShape">
-                        <wps:wsp>
-                          <wps:cNvSpPr/>
-                          <wps:spPr>
-                            <a:xfrm rot="10800000">
-                              <a:off x="0" y="0"/>
-                              <a:ext cx="4762500" cy="3352800"/>
-                            </a:xfrm>
-                            <a:prstGeom prst="halfFrame">
-                              <a:avLst>
-                                <a:gd name="adj1" fmla="val 5113"/>
-                                <a:gd name="adj2" fmla="val 1856"/>
-                              </a:avLst>
-                            </a:prstGeom>
-                          </wps:spPr>
-                          <wps:style>
-                            <a:lnRef idx="2">
-                              <a:schemeClr val="accent1">
-                                <a:shade val="15000"/>
-                              </a:schemeClr>
-                            </a:lnRef>
-                            <a:fillRef idx="1">
-                              <a:schemeClr val="accent1"/>
-                            </a:fillRef>
-                            <a:effectRef idx="0">
-                              <a:schemeClr val="accent1"/>
-                            </a:effectRef>
-                            <a:fontRef idx="minor">
-                              <a:schemeClr val="lt1"/>
-                            </a:fontRef>
-                          </wps:style>
-                          <wps:bodyPr rot="0" spcFirstLastPara="0" vertOverflow="overflow" horzOverflow="overflow" vert="horz" wrap="square" lIns="91440" tIns="45720" rIns="91440" bIns="45720" numCol="1" spcCol="0" rtlCol="0" fromWordArt="0" anchor="ctr" anchorCtr="0" forceAA="0" compatLnSpc="1">
-                            <a:prstTxWarp prst="textNoShape">
-                              <a:avLst/>
-                            </a:prstTxWarp>
-                            <a:noAutofit/>
-                          </wps:bodyPr>
-                        </wps:wsp>
-                      </a:graphicData>
-                    </a:graphic>
-                    <wp14:sizeRelH relativeFrom="margin">
-                      <wp14:pctWidth>0</wp14:pctWidth>
-                    </wp14:sizeRelH>
-                    <wp14:sizeRelV relativeFrom="margin">
-                      <wp14:pctHeight>0</wp14:pctHeight>
-                    </wp14:sizeRelV>
-                  </wp:anchor>
-                </w:drawing>
-              </mc:Choice>
-              <mc:Fallback xmlns:oel="http://schemas.microsoft.com/office/2019/extlst" xmlns:w16du="http://schemas.microsoft.com/office/word/2023/wordml/word16du" xmlns:w16sdtfl="http://schemas.microsoft.com/office/word/2024/wordml/sdtformatlock">
-                <w:pict>
-                  <v:shape w14:anchorId="04CC80B0" id="Medio marco 1" o:spid="_x0000_s1026" style="position:absolute;margin-left:121.2pt;margin-top:502.5pt;width:375pt;height:264pt;rotation:180;z-index:-251653120;visibility:visible;mso-wrap-style:square;mso-width-percent:0;mso-height-percent:0;mso-wrap-distance-left:9pt;mso-wrap-distance-top:0;mso-wrap-distance-right:9pt;mso-wrap-distance-bottom:0;mso-position-horizontal:absolute;mso-position-horizontal-relative:text;mso-position-vertical:absolute;mso-position-vertical-relative:page;mso-width-percent:0;mso-height-percent:0;mso-width-relative:margin;mso-height-relative:margin;v-text-anchor:middle" coordsize="4762500,3352800" o:gfxdata="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" path="m,l4762500,,4518993,171429r-4456765,l62228,3308992,,3352800,,xe" fillcolor="#4472c4 [3204]" strokecolor="#09101d [484]" strokeweight="1pt">
-                    <v:stroke joinstyle="miter"/>
-                    <v:path arrowok="t" o:connecttype="custom" o:connectlocs="0,0;4762500,0;4518993,171429;62228,171429;62228,3308992;0,3352800;0,0" o:connectangles="0,0,0,0,0,0,0"/>
-                    <w10:wrap anchory="page"/>
-                  </v:shape>
-                </w:pict>
-              </mc:Fallback>
-            </mc:AlternateContent>
-          </w:r>
-          <w:r>
-            <w:br w:type="page"/>
-          </w:r>
-        </w:p>
-      </w:sdtContent>
-    </w:sdt>
+    <w:sectPr>
+      <w:headerReference w:type="even" r:id="rId9"/>
+      <w:headerReference w:type="default" r:id="rId10"/>
+      <w:footerReference w:type="default" r:id="rId11"/>
+      <w:headerReference w:type="first" r:id="rId12"/>
+      <w:pgSz w:w="12240" w:h="15840"/>
+      <w:pgMar w:top="1417" w:right="1701" w:bottom="1417" w:left="1701" w:header="709" w:footer="397" w:gutter="0"/>
+      <w:pgNumType w:start="0"/>
+      <w:cols w:space="708"/>
+      <w:titlePg/>
+      <w:docGrid w:linePitch="360"/>
+    </w:sectPr>
   </w:body>
 </w:document>
 </file>

</xml_diff>